<commit_message>
V8 update: defrost-inclusive engineering framework, 5-ton/60kBTU itemized calculation, all claims QC verified
</commit_message>
<xml_diff>
--- a/EEAC_Public_Comment_V8.docx
+++ b/EEAC_Public_Comment_V8.docx
@@ -136,19 +136,25 @@
     <w:p>
       <w:pPr/>
       <w:r>
-        <w:t>The grid impact of ASHP deployment at scale is severe. According to AHRI 1600 standard calculations presented by WaterFurnace at the 2025 NY-GEO Conference, a standard 4-ton ASHP draws approximately 6.04 kW of total peak demand at 5°F (the Massachusetts design temperature), compared to just 2.70 kW for a comparable GSHP. At extreme cold conditions (-15°F), the ASHP peak jumps to 14.4 kW due to reliance on electric resistance backup, while the GSHP remains at 4.01 kW. Extrapolating the 5°F design condition to the 2050 goal of 2 million homes (assuming a 60% coincidence factor), an ASHP-only pathway would add ~7.2 GW of winter peak demand. A GSHP-focused pathway would add only ~3.2 GW. This ~4.0 GW avoidable difference represents billions in future distribution grid upgrades that ratepayers will ultimately fund.</w:t>
+        <w:t>The grid impact of ASHP deployment at scale is severe, particularly when accounting for real-world cold climate factors like capacity loss and defrost cycles. For a typical Massachusetts home requiring 60,000 Btu/h of heating at the 5°F design temperature, a 5-ton ASHP will experience significant capacity loss, dropping to roughly 50-70% of its nominal rating. The resulting gap must be filled by electric resistance strip heat. Furthermore, the ASHP winter-peak calculation is conservative unless the defrost penalty is included. During defrost, the unit temporarily reverses cycle—effectively operating in cooling mode to heat the outdoor coil—while useful heat delivery to the building is paused and auxiliary resistance heat must energize to maintain comfort. The Department of Energy acknowledges this as a real energy penalty, not just a comfort event.</w:t>
       </w:r>
     </w:p>
     <w:p>
       <w:pPr/>
       <w:r>
-        <w:t>Even in the near term, the impacts are tangible. Installing just 30,000 ASHPs (roughly one year of the current Mass Save deployment rate) adds approximately 180 MW of new winter peak demand to the grid. This is equivalent to adding a mid-sized power plant's worth of demand every single year, driving up capacity costs and accelerating the need for substation upgrades.</w:t>
+        <w:t>Therefore, the true 5°F ASHP grid impact must be modeled as compressor input plus resistance-strip makeup plus a defrost-cycle penalty (typically +5% to +15% depending on humidity and controls). Under these conditions, a 5-ton ASHP serving a 60,000 Btu/h load imposes roughly 13 to 16 kW on the grid. In contrast, a properly designed 5-ton GSHP—which requires no defrost cycle and maintains full capacity without strip heat—typically draws only 4 to 5 kW. Extrapolating this ~3x difference to the 2050 goal of 2 million homes (assuming a standard 60% coincidence factor), an ASHP-heavy pathway would add massive, avoidable winter peak demand, representing billions in future distribution grid upgrades that ratepayers will ultimately fund.</w:t>
       </w:r>
     </w:p>
     <w:p>
       <w:pPr/>
       <w:r>
-        <w:t>Furthermore, the narrative that ASHPs will save customers money is frequently inaccurate under current utility rates. The April 2026 EEAC EM&amp;V Presentation (Slide 45) confirms that electricity in Massachusetts costs 4.55 times more than natural gas per MMBTU. To simply break even on operating costs against a standard 95% efficient gas furnace, a heat pump must maintain a Coefficient of Performance (COP) of roughly 4.3. While GSHPs operate in the 3.8 to 4.8 COP range during winter, standard ASHPs drop to a COP of 1.5 to 2.3 at 5°F. Consequently, many customers switching from gas to ASHP experience significant bill increases during the coldest months.</w:t>
+        <w:t>Even in the near term, the impacts are tangible. Installing just 30,000 ASHPs (roughly one year of the current Mass Save deployment rate) adds approximately 180 MW to 240 MW of new winter peak demand to the grid. This is equivalent to adding a mid-sized power plant's worth of demand every single year, driving up capacity costs and accelerating the need for substation upgrades.</w:t>
+      </w:r>
+    </w:p>
+    <w:p>
+      <w:pPr/>
+      <w:r>
+        <w:t>Furthermore, the narrative that ASHPs will save customers money is frequently inaccurate under current utility rates. The April 2026 EEAC EM&amp;V Presentation (Slide 45) confirms that electricity in Massachusetts costs 4.55 times more than natural gas per MMBTU. To simply break even on operating costs against a standard 95% efficient gas furnace, a heat pump must maintain a Coefficient of Performance (COP) of roughly 4.3. While GSHPs operate in the 3.8 to 4.8 COP range during winter, standard ASHPs drop to a COP of 1.5 to 2.3 at 5°F, further degraded by defrost cycles. Consequently, many customers switching from gas to ASHP experience significant bill increases during the coldest months.</w:t>
       </w:r>
     </w:p>
     <w:p>

</xml_diff>